<commit_message>
Update project dashboard screenshot, include PBIX dashboard, and clean up temporary files
</commit_message>
<xml_diff>
--- a/banking_analytics_performance_report.docx
+++ b/banking_analytics_performance_report.docx
@@ -5155,7 +5155,7 @@
       <w:r>
         <w:drawing>
           <wp:inline xmlns:a="http://schemas.openxmlformats.org/drawingml/2006/main" xmlns:pic="http://schemas.openxmlformats.org/drawingml/2006/picture">
-            <wp:extent cx="5029200" cy="2806995"/>
+            <wp:extent cx="5029200" cy="3074712"/>
             <wp:docPr id="7" name="Picture 7"/>
             <wp:cNvGraphicFramePr>
               <a:graphicFrameLocks noChangeAspect="1"/>
@@ -5176,7 +5176,7 @@
                   <pic:spPr>
                     <a:xfrm>
                       <a:off x="0" y="0"/>
-                      <a:ext cx="5029200" cy="2806995"/>
+                      <a:ext cx="5029200" cy="3074712"/>
                     </a:xfrm>
                     <a:prstGeom prst="rect"/>
                   </pic:spPr>

</xml_diff>